<commit_message>
docs: bring the work list and findings up to end of day
Work list: the gate, encrypted backups and the browser-hole fix move to done;
encryption at rest closes as not possible with the reason; the disk-encryption
question narrows to the Windows Home policy, which now matters more because
FileVault is the only remaining protection for data at rest.

Findings: adds the gate and encrypted backups to what was built, the docker
compose $-mangling trap, and the Docker Desktop mount-propagation limit that
made encryption at rest undeliverable on a Mac while remaining ordinary on a
Linux host.

Co-Authored-By: Claude Opus 4.8 <noreply@anthropic.com>
Claude-Session: https://claude.ai/code/session_01Thi4wEaVVguyLZ8cDtWK8B
</commit_message>
<xml_diff>
--- a/docs/scp3-deployment-findings.docx
+++ b/docs/scp3-deployment-findings.docx
@@ -15,7 +15,7 @@
         <w:pStyle w:val="Subtitle"/>
       </w:pPr>
       <w:r>
-        <w:t xml:space="preserve">Working session record, July 22 2026</w:t>
+        <w:t xml:space="preserve">Working session record, July 22 2026 (revised end of day)</w:t>
       </w:r>
     </w:p>
     <w:sdt>
@@ -348,6 +348,41 @@
               <w:pStyle w:val="Compact"/>
             </w:pPr>
             <w:r>
+              <w:t xml:space="preserve">Entry</w:t>
+            </w:r>
+          </w:p>
+        </w:tc>
+        <w:tc>
+          <w:tcPr/>
+          <w:p>
+            <w:pPr>
+              <w:pStyle w:val="Compact"/>
+            </w:pPr>
+            <w:r>
+              <w:t xml:space="preserve">one gate, passphrase</w:t>
+            </w:r>
+          </w:p>
+        </w:tc>
+        <w:tc>
+          <w:tcPr/>
+          <w:p>
+            <w:pPr>
+              <w:pStyle w:val="Compact"/>
+            </w:pPr>
+            <w:r>
+              <w:t xml:space="preserve">Keycloak, private sites</w:t>
+            </w:r>
+          </w:p>
+        </w:tc>
+      </w:tr>
+      <w:tr>
+        <w:tc>
+          <w:tcPr/>
+          <w:p>
+            <w:pPr>
+              <w:pStyle w:val="Compact"/>
+            </w:pPr>
+            <w:r>
               <w:t xml:space="preserve">Status</w:t>
             </w:r>
           </w:p>
@@ -452,7 +487,7 @@
       </w:r>
     </w:p>
     <w:bookmarkEnd w:id="10"/>
-    <w:bookmarkStart w:id="14" w:name="what-was-built"/>
+    <w:bookmarkStart w:id="16" w:name="what-was-built"/>
     <w:p>
       <w:pPr>
         <w:pStyle w:val="Heading1"/>
@@ -598,7 +633,445 @@
       </w:r>
     </w:p>
     <w:bookmarkEnd w:id="12"/>
-    <w:bookmarkStart w:id="13" w:name="changes-to-coupler-proxy.py"/>
+    <w:bookmarkStart w:id="13" w:name="deployhome-one-gate-over-everything"/>
+    <w:p>
+      <w:pPr>
+        <w:pStyle w:val="Heading2"/>
+      </w:pPr>
+      <w:r>
+        <w:rPr>
+          <w:rStyle w:val="VerbatimChar"/>
+        </w:rPr>
+        <w:t xml:space="preserve">deploy/home/</w:t>
+      </w:r>
+      <w:r>
+        <w:t xml:space="preserve"> </w:t>
+      </w:r>
+      <w:r>
+        <w:t xml:space="preserve">— one gate over everything</w:t>
+      </w:r>
+    </w:p>
+    <w:p>
+      <w:pPr>
+        <w:pStyle w:val="FirstParagraph"/>
+      </w:pPr>
+      <w:r>
+        <w:t xml:space="preserve">Caddy is the only container that publishes ports; the wiki, coupler and</w:t>
+      </w:r>
+      <w:r>
+        <w:t xml:space="preserve"> </w:t>
+      </w:r>
+      <w:r>
+        <w:t xml:space="preserve">optionbox are</w:t>
+      </w:r>
+      <w:r>
+        <w:t xml:space="preserve"> </w:t>
+      </w:r>
+      <w:r>
+        <w:rPr>
+          <w:rStyle w:val="VerbatimChar"/>
+        </w:rPr>
+        <w:t xml:space="preserve">expose:</w:t>
+      </w:r>
+      <w:r>
+        <w:t xml:space="preserve"> </w:t>
+      </w:r>
+      <w:r>
+        <w:t xml:space="preserve">only and unreachable except through it. It listens on</w:t>
+      </w:r>
+      <w:r>
+        <w:t xml:space="preserve"> </w:t>
+      </w:r>
+      <w:r>
+        <w:t xml:space="preserve">the ports the tools already use, so no tool URLs changed.</w:t>
+      </w:r>
+    </w:p>
+    <w:p>
+      <w:pPr>
+        <w:pStyle w:val="BodyText"/>
+      </w:pPr>
+      <w:r>
+        <w:t xml:space="preserve">A gate over all three was necessary rather than tidy. The record lives in the</w:t>
+      </w:r>
+      <w:r>
+        <w:t xml:space="preserve"> </w:t>
+      </w:r>
+      <w:r>
+        <w:t xml:space="preserve">wiki, and the personal stack runs FedWiki with</w:t>
+      </w:r>
+      <w:r>
+        <w:t xml:space="preserve"> </w:t>
+      </w:r>
+      <w:r>
+        <w:rPr>
+          <w:rStyle w:val="VerbatimChar"/>
+        </w:rPr>
+        <w:t xml:space="preserve">--security_legacy</w:t>
+      </w:r>
+      <w:r>
+        <w:t xml:space="preserve">, so a</w:t>
+      </w:r>
+      <w:r>
+        <w:t xml:space="preserve"> </w:t>
+      </w:r>
+      <w:r>
+        <w:t xml:space="preserve">passphrase on the coupler alone would have left the record readable and</w:t>
+      </w:r>
+      <w:r>
+        <w:t xml:space="preserve"> </w:t>
+      </w:r>
+      <w:r>
+        <w:t xml:space="preserve">writable on port 3000 by anyone else using the computer.</w:t>
+      </w:r>
+    </w:p>
+    <w:p>
+      <w:pPr>
+        <w:pStyle w:val="BodyText"/>
+      </w:pPr>
+      <w:r>
+        <w:rPr>
+          <w:i/>
+          <w:iCs/>
+        </w:rPr>
+        <w:t xml:space="preserve">Verified:</w:t>
+      </w:r>
+      <w:r>
+        <w:t xml:space="preserve"> </w:t>
+      </w:r>
+      <w:r>
+        <w:t xml:space="preserve">every service returns 401 without the passphrase and works with it;</w:t>
+      </w:r>
+      <w:r>
+        <w:t xml:space="preserve"> </w:t>
+      </w:r>
+      <w:r>
+        <w:t xml:space="preserve">the full workflow runs through the gate; per-person sites stay isolated because</w:t>
+      </w:r>
+      <w:r>
+        <w:t xml:space="preserve"> </w:t>
+      </w:r>
+      <w:r>
+        <w:t xml:space="preserve">Caddy passes the original Host through; and the coupler’s own origin allowlist</w:t>
+      </w:r>
+      <w:r>
+        <w:t xml:space="preserve"> </w:t>
+      </w:r>
+      <w:r>
+        <w:t xml:space="preserve">still refuses foreign origins behind the gate.</w:t>
+      </w:r>
+    </w:p>
+    <w:p>
+      <w:pPr>
+        <w:pStyle w:val="BodyText"/>
+      </w:pPr>
+      <w:r>
+        <w:rPr>
+          <w:b/>
+          <w:bCs/>
+        </w:rPr>
+        <w:t xml:space="preserve">Trap found in the build.</w:t>
+      </w:r>
+      <w:r>
+        <w:t xml:space="preserve"> </w:t>
+      </w:r>
+      <w:r>
+        <w:t xml:space="preserve">Bcrypt hashes are full of</w:t>
+      </w:r>
+      <w:r>
+        <w:t xml:space="preserve"> </w:t>
+      </w:r>
+      <w:r>
+        <w:rPr>
+          <w:rStyle w:val="VerbatimChar"/>
+        </w:rPr>
+        <w:t xml:space="preserve">$</w:t>
+      </w:r>
+      <w:r>
+        <w:t xml:space="preserve">, and docker compose</w:t>
+      </w:r>
+      <w:r>
+        <w:t xml:space="preserve"> </w:t>
+      </w:r>
+      <w:r>
+        <w:t xml:space="preserve">reads</w:t>
+      </w:r>
+      <w:r>
+        <w:t xml:space="preserve"> </w:t>
+      </w:r>
+      <w:r>
+        <w:rPr>
+          <w:rStyle w:val="VerbatimChar"/>
+        </w:rPr>
+        <w:t xml:space="preserve">$</w:t>
+      </w:r>
+      <w:r>
+        <w:t xml:space="preserve"> </w:t>
+      </w:r>
+      <w:r>
+        <w:t xml:space="preserve">in</w:t>
+      </w:r>
+      <w:r>
+        <w:t xml:space="preserve"> </w:t>
+      </w:r>
+      <w:r>
+        <w:rPr>
+          <w:rStyle w:val="VerbatimChar"/>
+        </w:rPr>
+        <w:t xml:space="preserve">.env</w:t>
+      </w:r>
+      <w:r>
+        <w:t xml:space="preserve"> </w:t>
+      </w:r>
+      <w:r>
+        <w:t xml:space="preserve">as the start of a variable reference. The real hash</w:t>
+      </w:r>
+      <w:r>
+        <w:t xml:space="preserve"> </w:t>
+      </w:r>
+      <w:r>
+        <w:rPr>
+          <w:rStyle w:val="VerbatimChar"/>
+        </w:rPr>
+        <w:t xml:space="preserve">$2a$14$9PQEnODHsLk...</w:t>
+      </w:r>
+      <w:r>
+        <w:t xml:space="preserve"> </w:t>
+      </w:r>
+      <w:r>
+        <w:t xml:space="preserve">reached Caddy as</w:t>
+      </w:r>
+      <w:r>
+        <w:t xml:space="preserve"> </w:t>
+      </w:r>
+      <w:r>
+        <w:rPr>
+          <w:rStyle w:val="VerbatimChar"/>
+        </w:rPr>
+        <w:t xml:space="preserve">$$2a$$14.nfyY5TH...</w:t>
+      </w:r>
+      <w:r>
+        <w:t xml:space="preserve"> </w:t>
+      </w:r>
+      <w:r>
+        <w:t xml:space="preserve">— half of it</w:t>
+      </w:r>
+      <w:r>
+        <w:t xml:space="preserve"> </w:t>
+      </w:r>
+      <w:r>
+        <w:t xml:space="preserve">eaten. The gate would have installed cleanly and then rejected the correct</w:t>
+      </w:r>
+      <w:r>
+        <w:t xml:space="preserve"> </w:t>
+      </w:r>
+      <w:r>
+        <w:t xml:space="preserve">passphrase forever, with nothing in any log explaining why.</w:t>
+      </w:r>
+      <w:r>
+        <w:t xml:space="preserve"> </w:t>
+      </w:r>
+      <w:r>
+        <w:rPr>
+          <w:rStyle w:val="VerbatimChar"/>
+        </w:rPr>
+        <w:t xml:space="preserve">set-passphrase.sh</w:t>
+      </w:r>
+      <w:r>
+        <w:t xml:space="preserve"> </w:t>
+      </w:r>
+      <w:r>
+        <w:t xml:space="preserve">doubles the</w:t>
+      </w:r>
+      <w:r>
+        <w:t xml:space="preserve"> </w:t>
+      </w:r>
+      <w:r>
+        <w:rPr>
+          <w:rStyle w:val="VerbatimChar"/>
+        </w:rPr>
+        <w:t xml:space="preserve">$</w:t>
+      </w:r>
+      <w:r>
+        <w:t xml:space="preserve"> </w:t>
+      </w:r>
+      <w:r>
+        <w:t xml:space="preserve">signs, which is why the passphrase must never be set by</w:t>
+      </w:r>
+      <w:r>
+        <w:t xml:space="preserve"> </w:t>
+      </w:r>
+      <w:r>
+        <w:t xml:space="preserve">hand-editing</w:t>
+      </w:r>
+      <w:r>
+        <w:t xml:space="preserve"> </w:t>
+      </w:r>
+      <w:r>
+        <w:rPr>
+          <w:rStyle w:val="VerbatimChar"/>
+        </w:rPr>
+        <w:t xml:space="preserve">.env</w:t>
+      </w:r>
+      <w:r>
+        <w:t xml:space="preserve">.</w:t>
+      </w:r>
+    </w:p>
+    <w:bookmarkEnd w:id="13"/>
+    <w:bookmarkStart w:id="14" w:name="deployhome-encrypted-backups"/>
+    <w:p>
+      <w:pPr>
+        <w:pStyle w:val="Heading2"/>
+      </w:pPr>
+      <w:r>
+        <w:rPr>
+          <w:rStyle w:val="VerbatimChar"/>
+        </w:rPr>
+        <w:t xml:space="preserve">deploy/home/</w:t>
+      </w:r>
+      <w:r>
+        <w:t xml:space="preserve"> </w:t>
+      </w:r>
+      <w:r>
+        <w:t xml:space="preserve">— encrypted backups</w:t>
+      </w:r>
+    </w:p>
+    <w:p>
+      <w:pPr>
+        <w:pStyle w:val="FirstParagraph"/>
+      </w:pPr>
+      <w:r>
+        <w:rPr>
+          <w:rStyle w:val="VerbatimChar"/>
+        </w:rPr>
+        <w:t xml:space="preserve">./backup.sh</w:t>
+      </w:r>
+      <w:r>
+        <w:t xml:space="preserve"> </w:t>
+      </w:r>
+      <w:r>
+        <w:t xml:space="preserve">writes one encrypted file per run (AES-256, key stretched from</w:t>
+      </w:r>
+      <w:r>
+        <w:t xml:space="preserve"> </w:t>
+      </w:r>
+      <w:r>
+        <w:t xml:space="preserve">the passphrase by PBKDF2 at 600,000 rounds; the passphrase reaches openssl on a</w:t>
+      </w:r>
+      <w:r>
+        <w:t xml:space="preserve"> </w:t>
+      </w:r>
+      <w:r>
+        <w:t xml:space="preserve">file descriptor, never on the command line).</w:t>
+      </w:r>
+      <w:r>
+        <w:t xml:space="preserve"> </w:t>
+      </w:r>
+      <w:r>
+        <w:rPr>
+          <w:rStyle w:val="VerbatimChar"/>
+        </w:rPr>
+        <w:t xml:space="preserve">./restore.sh --verify</w:t>
+      </w:r>
+      <w:r>
+        <w:t xml:space="preserve"> </w:t>
+      </w:r>
+      <w:r>
+        <w:t xml:space="preserve">opens a</w:t>
+      </w:r>
+      <w:r>
+        <w:t xml:space="preserve"> </w:t>
+      </w:r>
+      <w:r>
+        <w:t xml:space="preserve">backup and reports what is in it without touching the live record.</w:t>
+      </w:r>
+      <w:r>
+        <w:t xml:space="preserve"> </w:t>
+      </w:r>
+      <w:r>
+        <w:rPr>
+          <w:rStyle w:val="VerbatimChar"/>
+        </w:rPr>
+        <w:t xml:space="preserve">./restore.sh</w:t>
+      </w:r>
+      <w:r>
+        <w:t xml:space="preserve"> </w:t>
+      </w:r>
+      <w:r>
+        <w:t xml:space="preserve">replaces the record, saving the current one first.</w:t>
+      </w:r>
+    </w:p>
+    <w:p>
+      <w:pPr>
+        <w:pStyle w:val="BodyText"/>
+      </w:pPr>
+      <w:r>
+        <w:t xml:space="preserve">Because the file is unreadable without the passphrase it can live anywhere</w:t>
+      </w:r>
+      <w:r>
+        <w:t xml:space="preserve"> </w:t>
+      </w:r>
+      <w:r>
+        <w:t xml:space="preserve">ordinary — USB stick, Dropbox, iCloud. That is the point: without encryption</w:t>
+      </w:r>
+      <w:r>
+        <w:t xml:space="preserve"> </w:t>
+      </w:r>
+      <w:r>
+        <w:t xml:space="preserve">there is nowhere good to put a backup of a health record.</w:t>
+      </w:r>
+    </w:p>
+    <w:p>
+      <w:pPr>
+        <w:pStyle w:val="BodyText"/>
+      </w:pPr>
+      <w:r>
+        <w:rPr>
+          <w:i/>
+          <w:iCs/>
+        </w:rPr>
+        <w:t xml:space="preserve">Verified</w:t>
+      </w:r>
+      <w:r>
+        <w:t xml:space="preserve"> </w:t>
+      </w:r>
+      <w:r>
+        <w:t xml:space="preserve">by deleting the volumes outright and restoring: both people, a</w:t>
+      </w:r>
+      <w:r>
+        <w:t xml:space="preserve"> </w:t>
+      </w:r>
+      <w:r>
+        <w:t xml:space="preserve">canary file, and a wiki page all came back and served correctly through the</w:t>
+      </w:r>
+      <w:r>
+        <w:t xml:space="preserve"> </w:t>
+      </w:r>
+      <w:r>
+        <w:t xml:space="preserve">gate. Wrong passphrase fails cleanly on verify and on restore. The canary is</w:t>
+      </w:r>
+      <w:r>
+        <w:t xml:space="preserve"> </w:t>
+      </w:r>
+      <w:r>
+        <w:t xml:space="preserve">not findable in the backup file.</w:t>
+      </w:r>
+    </w:p>
+    <w:p>
+      <w:pPr>
+        <w:pStyle w:val="BodyText"/>
+      </w:pPr>
+      <w:r>
+        <w:t xml:space="preserve">This is the one place where an unrecoverable secret is low risk: forgetting a</w:t>
+      </w:r>
+      <w:r>
+        <w:t xml:space="preserve"> </w:t>
+      </w:r>
+      <w:r>
+        <w:t xml:space="preserve">backup passphrase costs the backup, not the record.</w:t>
+      </w:r>
+    </w:p>
+    <w:bookmarkEnd w:id="14"/>
+    <w:bookmarkStart w:id="15" w:name="changes-to-coupler-proxy.py"/>
     <w:p>
       <w:pPr>
         <w:pStyle w:val="Heading2"/>
@@ -818,9 +1291,9 @@
         </w:pict>
       </w:r>
     </w:p>
-    <w:bookmarkEnd w:id="13"/>
-    <w:bookmarkEnd w:id="14"/>
-    <w:bookmarkStart w:id="20" w:name="findings-personal-computer"/>
+    <w:bookmarkEnd w:id="15"/>
+    <w:bookmarkEnd w:id="16"/>
+    <w:bookmarkStart w:id="23" w:name="findings-personal-computer"/>
     <w:p>
       <w:pPr>
         <w:pStyle w:val="Heading1"/>
@@ -829,7 +1302,7 @@
         <w:t xml:space="preserve">Findings — personal computer</w:t>
       </w:r>
     </w:p>
-    <w:bookmarkStart w:id="15" w:name="Xf986025407041d33d2829a039ddf77d35383afe"/>
+    <w:bookmarkStart w:id="17" w:name="Xf986025407041d33d2829a039ddf77d35383afe"/>
     <w:p>
       <w:pPr>
         <w:pStyle w:val="Heading2"/>
@@ -1029,8 +1502,8 @@
         <w:t xml:space="preserve">directories explicitly.</w:t>
       </w:r>
     </w:p>
-    <w:bookmarkEnd w:id="15"/>
-    <w:bookmarkStart w:id="16" w:name="X6e87e197b21ea2b3aa3ae909305539d760a5a89"/>
+    <w:bookmarkEnd w:id="17"/>
+    <w:bookmarkStart w:id="18" w:name="X6e87e197b21ea2b3aa3ae909305539d760a5a89"/>
     <w:p>
       <w:pPr>
         <w:pStyle w:val="Heading2"/>
@@ -1234,8 +1707,8 @@
         <w:t xml:space="preserve">proxy. That is the passphrase item on the work list.</w:t>
       </w:r>
     </w:p>
-    <w:bookmarkEnd w:id="16"/>
-    <w:bookmarkStart w:id="17" w:name="X142299dd0e4764c858e7de3b7b33d035a5e7659"/>
+    <w:bookmarkEnd w:id="18"/>
+    <w:bookmarkStart w:id="19" w:name="X142299dd0e4764c858e7de3b7b33d035a5e7659"/>
     <w:p>
       <w:pPr>
         <w:pStyle w:val="Heading2"/>
@@ -1464,8 +1937,8 @@
         <w:t xml:space="preserve">settings depend on each other and should not be separated.</w:t>
       </w:r>
     </w:p>
-    <w:bookmarkEnd w:id="17"/>
-    <w:bookmarkStart w:id="18" w:name="X5855c49f75679146d375e69d75d724db4a217e2"/>
+    <w:bookmarkEnd w:id="19"/>
+    <w:bookmarkStart w:id="20" w:name="X5855c49f75679146d375e69d75d724db4a217e2"/>
     <w:p>
       <w:pPr>
         <w:pStyle w:val="Heading2"/>
@@ -1595,8 +2068,230 @@
         <w:t xml:space="preserve">by writing through the wiki’s API.</w:t>
       </w:r>
     </w:p>
-    <w:bookmarkEnd w:id="18"/>
-    <w:bookmarkStart w:id="19" w:name="the-container-produced-no-logs"/>
+    <w:bookmarkEnd w:id="20"/>
+    <w:bookmarkStart w:id="21" w:name="Xdd02b1e12740dee607961e590b339af4902abf5"/>
+    <w:p>
+      <w:pPr>
+        <w:pStyle w:val="Heading2"/>
+      </w:pPr>
+      <w:r>
+        <w:t xml:space="preserve">Encryption at rest is not deliverable on Docker Desktop</w:t>
+      </w:r>
+    </w:p>
+    <w:p>
+      <w:pPr>
+        <w:pStyle w:val="FirstParagraph"/>
+      </w:pPr>
+      <w:r>
+        <w:t xml:space="preserve">Built, tested, and removed rather than shipped.</w:t>
+      </w:r>
+    </w:p>
+    <w:p>
+      <w:pPr>
+        <w:pStyle w:val="BodyText"/>
+      </w:pPr>
+      <w:r>
+        <w:t xml:space="preserve">The encrypted store itself worked: an encrypted sparsebundle created from the</w:t>
+      </w:r>
+      <w:r>
+        <w:t xml:space="preserve"> </w:t>
+      </w:r>
+      <w:r>
+        <w:t xml:space="preserve">passphrase, the existing record migrated in, wrong passphrase refused, and with</w:t>
+      </w:r>
+      <w:r>
+        <w:t xml:space="preserve"> </w:t>
+      </w:r>
+      <w:r>
+        <w:t xml:space="preserve">it locked the mountpoint held zero files and a planted canary string was not</w:t>
+      </w:r>
+      <w:r>
+        <w:t xml:space="preserve"> </w:t>
+      </w:r>
+      <w:r>
+        <w:t xml:space="preserve">findable anywhere in the image.</w:t>
+      </w:r>
+    </w:p>
+    <w:p>
+      <w:pPr>
+        <w:pStyle w:val="BodyText"/>
+      </w:pPr>
+      <w:r>
+        <w:t xml:space="preserve">What failed is Docker reaching it. Docker Desktop runs a Linux virtual machine</w:t>
+      </w:r>
+      <w:r>
+        <w:t xml:space="preserve"> </w:t>
+      </w:r>
+      <w:r>
+        <w:t xml:space="preserve">and shares folders into it, and that sharing is established when Docker starts.</w:t>
+      </w:r>
+      <w:r>
+        <w:t xml:space="preserve"> </w:t>
+      </w:r>
+      <w:r>
+        <w:rPr>
+          <w:b/>
+          <w:bCs/>
+        </w:rPr>
+        <w:t xml:space="preserve">A filesystem mounted afterwards never propagates into the VM.</w:t>
+      </w:r>
+      <w:r>
+        <w:t xml:space="preserve"> </w:t>
+      </w:r>
+      <w:r>
+        <w:t xml:space="preserve">From inside</w:t>
+      </w:r>
+      <w:r>
+        <w:t xml:space="preserve"> </w:t>
+      </w:r>
+      <w:r>
+        <w:t xml:space="preserve">the VM the folder name is visible but the mount is not —</w:t>
+      </w:r>
+      <w:r>
+        <w:t xml:space="preserve"> </w:t>
+      </w:r>
+      <w:r>
+        <w:rPr>
+          <w:rStyle w:val="VerbatimChar"/>
+        </w:rPr>
+        <w:t xml:space="preserve">Operation not permitted</w:t>
+      </w:r>
+      <w:r>
+        <w:t xml:space="preserve">.</w:t>
+      </w:r>
+    </w:p>
+    <w:p>
+      <w:pPr>
+        <w:pStyle w:val="BodyText"/>
+      </w:pPr>
+      <w:r>
+        <w:rPr>
+          <w:i/>
+          <w:iCs/>
+        </w:rPr>
+        <w:t xml:space="preserve">Evidence:</w:t>
+      </w:r>
+      <w:r>
+        <w:t xml:space="preserve"> </w:t>
+      </w:r>
+      <w:r>
+        <w:t xml:space="preserve">it worked once, then failed on every subsequent unlock. Tried</w:t>
+      </w:r>
+      <w:r>
+        <w:t xml:space="preserve"> </w:t>
+      </w:r>
+      <w:r>
+        <w:t xml:space="preserve">inside the project, at</w:t>
+      </w:r>
+      <w:r>
+        <w:t xml:space="preserve"> </w:t>
+      </w:r>
+      <w:r>
+        <w:rPr>
+          <w:rStyle w:val="VerbatimChar"/>
+        </w:rPr>
+        <w:t xml:space="preserve">/Volumes</w:t>
+      </w:r>
+      <w:r>
+        <w:t xml:space="preserve">, and with a freshly-named mountpoint each</w:t>
+      </w:r>
+      <w:r>
+        <w:t xml:space="preserve"> </w:t>
+      </w:r>
+      <w:r>
+        <w:t xml:space="preserve">time; all failed identically. The single success was timing luck — the path</w:t>
+      </w:r>
+      <w:r>
+        <w:t xml:space="preserve"> </w:t>
+      </w:r>
+      <w:r>
+        <w:t xml:space="preserve">happened to be new when Docker first looked at it.</w:t>
+      </w:r>
+    </w:p>
+    <w:p>
+      <w:pPr>
+        <w:pStyle w:val="BodyText"/>
+      </w:pPr>
+      <w:r>
+        <w:t xml:space="preserve">The practical consequence is that it works once per Docker Desktop restart.</w:t>
+      </w:r>
+      <w:r>
+        <w:t xml:space="preserve"> </w:t>
+      </w:r>
+      <w:r>
+        <w:t xml:space="preserve">Locking the record at night and unlocking it in the morning would mean</w:t>
+      </w:r>
+      <w:r>
+        <w:t xml:space="preserve"> </w:t>
+      </w:r>
+      <w:r>
+        <w:t xml:space="preserve">restarting Docker Desktop first, which is not something to hand to someone in</w:t>
+      </w:r>
+      <w:r>
+        <w:t xml:space="preserve"> </w:t>
+      </w:r>
+      <w:r>
+        <w:t xml:space="preserve">Superior AZ.</w:t>
+      </w:r>
+    </w:p>
+    <w:p>
+      <w:pPr>
+        <w:pStyle w:val="BodyText"/>
+      </w:pPr>
+      <w:r>
+        <w:t xml:space="preserve">On a Linux host — WikiCafe’s server — the same pattern is ordinary and works.</w:t>
+      </w:r>
+      <w:r>
+        <w:t xml:space="preserve"> </w:t>
+      </w:r>
+      <w:r>
+        <w:t xml:space="preserve">The failure was about Docker Desktop, not about the idea. It also means any</w:t>
+      </w:r>
+      <w:r>
+        <w:t xml:space="preserve"> </w:t>
+      </w:r>
+      <w:r>
+        <w:t xml:space="preserve">future requirement for encryption at rest beyond FileVault argues for a</w:t>
+      </w:r>
+      <w:r>
+        <w:t xml:space="preserve"> </w:t>
+      </w:r>
+      <w:r>
+        <w:t xml:space="preserve">different runtime, which is a larger decision than a script.</w:t>
+      </w:r>
+    </w:p>
+    <w:p>
+      <w:pPr>
+        <w:pStyle w:val="BodyText"/>
+      </w:pPr>
+      <w:r>
+        <w:rPr>
+          <w:b/>
+          <w:bCs/>
+        </w:rPr>
+        <w:t xml:space="preserve">Consequence:</w:t>
+      </w:r>
+      <w:r>
+        <w:t xml:space="preserve"> </w:t>
+      </w:r>
+      <w:r>
+        <w:t xml:space="preserve">disk encryption is now the only protection for data at rest on</w:t>
+      </w:r>
+      <w:r>
+        <w:t xml:space="preserve"> </w:t>
+      </w:r>
+      <w:r>
+        <w:t xml:space="preserve">a personal machine, which raises the stakes on Windows Home machines that</w:t>
+      </w:r>
+      <w:r>
+        <w:t xml:space="preserve"> </w:t>
+      </w:r>
+      <w:r>
+        <w:t xml:space="preserve">cannot do it at all.</w:t>
+      </w:r>
+    </w:p>
+    <w:bookmarkEnd w:id="21"/>
+    <w:bookmarkStart w:id="22" w:name="the-container-produced-no-logs"/>
     <w:p>
       <w:pPr>
         <w:pStyle w:val="Heading2"/>
@@ -1698,9 +2393,9 @@
         </w:pict>
       </w:r>
     </w:p>
-    <w:bookmarkEnd w:id="19"/>
-    <w:bookmarkEnd w:id="20"/>
-    <w:bookmarkStart w:id="21" w:name="Xb01fd1bb5a0e98d4e5147ca261c93ed05a36d9e"/>
+    <w:bookmarkEnd w:id="22"/>
+    <w:bookmarkEnd w:id="23"/>
+    <w:bookmarkStart w:id="24" w:name="Xb01fd1bb5a0e98d4e5147ca261c93ed05a36d9e"/>
     <w:p>
       <w:pPr>
         <w:pStyle w:val="Heading1"/>
@@ -1802,8 +2497,8 @@
         </w:pict>
       </w:r>
     </w:p>
-    <w:bookmarkEnd w:id="21"/>
-    <w:bookmarkStart w:id="27" w:name="findings-wikicafe"/>
+    <w:bookmarkEnd w:id="24"/>
+    <w:bookmarkStart w:id="30" w:name="findings-wikicafe"/>
     <w:p>
       <w:pPr>
         <w:pStyle w:val="Heading1"/>
@@ -1835,7 +2530,7 @@
         <w:t xml:space="preserve">is untouched.</w:t>
       </w:r>
     </w:p>
-    <w:bookmarkStart w:id="22" w:name="test-data-is-inside-the-published-image"/>
+    <w:bookmarkStart w:id="25" w:name="test-data-is-inside-the-published-image"/>
     <w:p>
       <w:pPr>
         <w:pStyle w:val="Heading2"/>
@@ -1953,8 +2648,8 @@
         <w:t xml:space="preserve">the next image build publishes them, silently.</w:t>
       </w:r>
     </w:p>
-    <w:bookmarkEnd w:id="22"/>
-    <w:bookmarkStart w:id="23" w:name="Xfb26420dcf4c985652d448f15c1bbd3f72711e8"/>
+    <w:bookmarkEnd w:id="25"/>
+    <w:bookmarkStart w:id="26" w:name="Xfb26420dcf4c985652d448f15c1bbd3f72711e8"/>
     <w:p>
       <w:pPr>
         <w:pStyle w:val="Heading2"/>
@@ -2028,8 +2723,8 @@
         <w:t xml:space="preserve">WikiCafe generated and sent you.</w:t>
       </w:r>
     </w:p>
-    <w:bookmarkEnd w:id="23"/>
-    <w:bookmarkStart w:id="24" w:name="X3cf91bc31952d6fe19b7bdf0b80b97843240dab"/>
+    <w:bookmarkEnd w:id="26"/>
+    <w:bookmarkStart w:id="27" w:name="X3cf91bc31952d6fe19b7bdf0b80b97843240dab"/>
     <w:p>
       <w:pPr>
         <w:pStyle w:val="Heading2"/>
@@ -2161,8 +2856,8 @@
         <w:t xml:space="preserve">/api/provision-patient</w:t>
       </w:r>
     </w:p>
-    <w:bookmarkEnd w:id="24"/>
-    <w:bookmarkStart w:id="25" w:name="keycloak-does-not-cover-the-proxy"/>
+    <w:bookmarkEnd w:id="27"/>
+    <w:bookmarkStart w:id="28" w:name="keycloak-does-not-cover-the-proxy"/>
     <w:p>
       <w:pPr>
         <w:pStyle w:val="Heading2"/>
@@ -2226,8 +2921,8 @@
         <w:t xml:space="preserve">into the same records, standing open beside a locked front door.</w:t>
       </w:r>
     </w:p>
-    <w:bookmarkEnd w:id="25"/>
-    <w:bookmarkStart w:id="26" w:name="no-per-user-authorization"/>
+    <w:bookmarkEnd w:id="28"/>
+    <w:bookmarkStart w:id="29" w:name="no-per-user-authorization"/>
     <w:p>
       <w:pPr>
         <w:pStyle w:val="Heading2"/>
@@ -2310,9 +3005,9 @@
         </w:pict>
       </w:r>
     </w:p>
-    <w:bookmarkEnd w:id="26"/>
-    <w:bookmarkEnd w:id="27"/>
-    <w:bookmarkStart w:id="28" w:name="method-and-limits"/>
+    <w:bookmarkEnd w:id="29"/>
+    <w:bookmarkEnd w:id="30"/>
+    <w:bookmarkStart w:id="31" w:name="method-and-limits"/>
     <w:p>
       <w:pPr>
         <w:pStyle w:val="Heading1"/>
@@ -2427,7 +3122,7 @@
         <w:t xml:space="preserve">answering, not the containers, whose bindings were correct throughout.</w:t>
       </w:r>
     </w:p>
-    <w:bookmarkEnd w:id="28"/>
+    <w:bookmarkEnd w:id="31"/>
     <w:sectPr>
       <w:footnotePr>
         <w:numRestart w:val="eachSect"/>

</xml_diff>